<commit_message>
Aire Express setter: furnace replacement quoted by phone with 4 home details
Speech 01, objections, practice script and onboarding school updated so the
furnace line collects stories, basement, chimney and furnace age for a phone quote.

Co-Authored-By: Claude Opus 5.5 <noreply@anthropic.com>
</commit_message>
<xml_diff>
--- a/induccion-aire-express/guiones/docs/01_SOLICITUD_VIDEO_DE_LLAMADA.docx
+++ b/induccion-aire-express/guiones/docs/01_SOLICITUD_VIDEO_DE_LLAMADA.docx
@@ -811,7 +811,7 @@
           <w:sz w:val="17"/>
           <w:szCs w:val="17"/>
         </w:rPr>
-        <w:t xml:space="preserve">        Your exact price depends on your home, so our technician confirms it at a free visit — it takes about 20 minutes.</w:t>
+        <w:t xml:space="preserve">        And I can get you your exact price over the phone. I just need 4 quick things. How many stories is your home?</w:t>
       </w:r>
     </w:p>
     <w:p>
@@ -824,11 +824,22 @@
       <w:r>
         <w:rPr>
           <w:rFonts w:ascii="Courier New" w:cs="Courier New" w:eastAsia="Courier New" w:hAnsi="Courier New"/>
-          <w:color w:val="1B2A4A"/>
-          <w:sz w:val="17"/>
-          <w:szCs w:val="17"/>
-        </w:rPr>
-        <w:t xml:space="preserve">        I have Thursday at 10 a.m. or Friday at 5 p.m. Which one works better?</w:t>
+          <w:b w:val="false"/>
+          <w:bCs w:val="false"/>
+          <w:color w:val="1B2A4A"/>
+          <w:sz w:val="17"/>
+          <w:szCs w:val="17"/>
+        </w:rPr>
+        <w:t xml:space="preserve">JOHN</w:t>
+      </w:r>
+      <w:r>
+        <w:rPr>
+          <w:rFonts w:ascii="Courier New" w:cs="Courier New" w:eastAsia="Courier New" w:hAnsi="Courier New"/>
+          <w:color w:val="1B2A4A"/>
+          <w:sz w:val="17"/>
+          <w:szCs w:val="17"/>
+        </w:rPr>
+        <w:t xml:space="preserve">:   Two.</w:t>
       </w:r>
     </w:p>
     <w:p>
@@ -847,16 +858,16 @@
           <w:sz w:val="17"/>
           <w:szCs w:val="17"/>
         </w:rPr>
-        <w:t xml:space="preserve">JOHN</w:t>
-      </w:r>
-      <w:r>
-        <w:rPr>
-          <w:rFonts w:ascii="Courier New" w:cs="Courier New" w:eastAsia="Courier New" w:hAnsi="Courier New"/>
-          <w:color w:val="1B2A4A"/>
-          <w:sz w:val="17"/>
-          <w:szCs w:val="17"/>
-        </w:rPr>
-        <w:t xml:space="preserve">:   I don't know... I don't want to pay anything upfront.</w:t>
+        <w:t xml:space="preserve">YOU</w:t>
+      </w:r>
+      <w:r>
+        <w:rPr>
+          <w:rFonts w:ascii="Courier New" w:cs="Courier New" w:eastAsia="Courier New" w:hAnsi="Courier New"/>
+          <w:color w:val="1B2A4A"/>
+          <w:sz w:val="17"/>
+          <w:szCs w:val="17"/>
+        </w:rPr>
+        <w:t xml:space="preserve">:    Do you have a basement? Is it finished, like a living space, or unfinished?</w:t>
       </w:r>
     </w:p>
     <w:p>
@@ -875,16 +886,16 @@
           <w:sz w:val="17"/>
           <w:szCs w:val="17"/>
         </w:rPr>
-        <w:t xml:space="preserve">YOU</w:t>
-      </w:r>
-      <w:r>
-        <w:rPr>
-          <w:rFonts w:ascii="Courier New" w:cs="Courier New" w:eastAsia="Courier New" w:hAnsi="Courier New"/>
-          <w:color w:val="1B2A4A"/>
-          <w:sz w:val="17"/>
-          <w:szCs w:val="17"/>
-        </w:rPr>
-        <w:t xml:space="preserve">:    No problem — you can sign the contract and pay when the job is done. Thursday at 10 or Friday at 5?</w:t>
+        <w:t xml:space="preserve">JOHN</w:t>
+      </w:r>
+      <w:r>
+        <w:rPr>
+          <w:rFonts w:ascii="Courier New" w:cs="Courier New" w:eastAsia="Courier New" w:hAnsi="Courier New"/>
+          <w:color w:val="1B2A4A"/>
+          <w:sz w:val="17"/>
+          <w:szCs w:val="17"/>
+        </w:rPr>
+        <w:t xml:space="preserve">:   Unfinished. The furnace is down there.</w:t>
       </w:r>
     </w:p>
     <w:p>
@@ -903,16 +914,16 @@
           <w:sz w:val="17"/>
           <w:szCs w:val="17"/>
         </w:rPr>
-        <w:t xml:space="preserve">JOHN</w:t>
-      </w:r>
-      <w:r>
-        <w:rPr>
-          <w:rFonts w:ascii="Courier New" w:cs="Courier New" w:eastAsia="Courier New" w:hAnsi="Courier New"/>
-          <w:color w:val="1B2A4A"/>
-          <w:sz w:val="17"/>
-          <w:szCs w:val="17"/>
-        </w:rPr>
-        <w:t xml:space="preserve">:   Friday at 5 works.</w:t>
+        <w:t xml:space="preserve">YOU</w:t>
+      </w:r>
+      <w:r>
+        <w:rPr>
+          <w:rFonts w:ascii="Courier New" w:cs="Courier New" w:eastAsia="Courier New" w:hAnsi="Courier New"/>
+          <w:color w:val="1B2A4A"/>
+          <w:sz w:val="17"/>
+          <w:szCs w:val="17"/>
+        </w:rPr>
+        <w:t xml:space="preserve">:    Does your home have a chimney?</w:t>
       </w:r>
     </w:p>
     <w:p>
@@ -931,16 +942,16 @@
           <w:sz w:val="17"/>
           <w:szCs w:val="17"/>
         </w:rPr>
-        <w:t xml:space="preserve">YOU</w:t>
-      </w:r>
-      <w:r>
-        <w:rPr>
-          <w:rFonts w:ascii="Courier New" w:cs="Courier New" w:eastAsia="Courier New" w:hAnsi="Courier New"/>
-          <w:color w:val="1B2A4A"/>
-          <w:sz w:val="17"/>
-          <w:szCs w:val="17"/>
-        </w:rPr>
-        <w:t xml:space="preserve">:    Perfect. Is the visit at the address you gave us, on Main Street?</w:t>
+        <w:t xml:space="preserve">JOHN</w:t>
+      </w:r>
+      <w:r>
+        <w:rPr>
+          <w:rFonts w:ascii="Courier New" w:cs="Courier New" w:eastAsia="Courier New" w:hAnsi="Courier New"/>
+          <w:color w:val="1B2A4A"/>
+          <w:sz w:val="17"/>
+          <w:szCs w:val="17"/>
+        </w:rPr>
+        <w:t xml:space="preserve">:   No.</w:t>
       </w:r>
     </w:p>
     <w:p>
@@ -959,16 +970,16 @@
           <w:sz w:val="17"/>
           <w:szCs w:val="17"/>
         </w:rPr>
-        <w:t xml:space="preserve">JOHN</w:t>
-      </w:r>
-      <w:r>
-        <w:rPr>
-          <w:rFonts w:ascii="Courier New" w:cs="Courier New" w:eastAsia="Courier New" w:hAnsi="Courier New"/>
-          <w:color w:val="1B2A4A"/>
-          <w:sz w:val="17"/>
-          <w:szCs w:val="17"/>
-        </w:rPr>
-        <w:t xml:space="preserve">:   Yes.</w:t>
+        <w:t xml:space="preserve">YOU</w:t>
+      </w:r>
+      <w:r>
+        <w:rPr>
+          <w:rFonts w:ascii="Courier New" w:cs="Courier New" w:eastAsia="Courier New" w:hAnsi="Courier New"/>
+          <w:color w:val="1B2A4A"/>
+          <w:sz w:val="17"/>
+          <w:szCs w:val="17"/>
+        </w:rPr>
+        <w:t xml:space="preserve">:    And is it a gas furnace? About how old is it?</w:t>
       </w:r>
     </w:p>
     <w:p>
@@ -987,6 +998,34 @@
           <w:sz w:val="17"/>
           <w:szCs w:val="17"/>
         </w:rPr>
+        <w:t xml:space="preserve">JOHN</w:t>
+      </w:r>
+      <w:r>
+        <w:rPr>
+          <w:rFonts w:ascii="Courier New" w:cs="Courier New" w:eastAsia="Courier New" w:hAnsi="Courier New"/>
+          <w:color w:val="1B2A4A"/>
+          <w:sz w:val="17"/>
+          <w:szCs w:val="17"/>
+        </w:rPr>
+        <w:t xml:space="preserve">:   Gas, maybe 18 years.</w:t>
+      </w:r>
+    </w:p>
+    <w:p>
+      <w:pPr>
+        <w:keepLines/>
+        <w:shd w:fill="F2F4F7" w:val="clear"/>
+        <w:spacing w:after="0"/>
+        <w:ind w:left="100" w:right="100"/>
+      </w:pPr>
+      <w:r>
+        <w:rPr>
+          <w:rFonts w:ascii="Courier New" w:cs="Courier New" w:eastAsia="Courier New" w:hAnsi="Courier New"/>
+          <w:b w:val="false"/>
+          <w:bCs w:val="false"/>
+          <w:color w:val="1B2A4A"/>
+          <w:sz w:val="17"/>
+          <w:szCs w:val="17"/>
+        </w:rPr>
         <w:t xml:space="preserve">YOU</w:t>
       </w:r>
       <w:r>
@@ -996,7 +1035,139 @@
           <w:sz w:val="17"/>
           <w:szCs w:val="17"/>
         </w:rPr>
-        <w:t xml:space="preserve">:    Great, you're booked for Friday at 5 p.m. Our technician will see you then, and you'll get a confirmation. Thank you, John!</w:t>
+        <w:t xml:space="preserve">:    Perfect. And the address is the one on Main Street, </w:t>
+      </w:r>
+      <w:r>
+        <w:rPr>
+          <w:rFonts w:ascii="Courier New" w:cs="Courier New" w:eastAsia="Courier New" w:hAnsi="Courier New"/>
+          <w:b w:val="false"/>
+          <w:bCs w:val="false"/>
+          <w:color w:val="1B2A4A"/>
+          <w:sz w:val="17"/>
+          <w:szCs w:val="17"/>
+        </w:rPr>
+        <w:t xml:space="preserve">ZIP</w:t>
+      </w:r>
+      <w:r>
+        <w:rPr>
+          <w:rFonts w:ascii="Courier New" w:cs="Courier New" w:eastAsia="Courier New" w:hAnsi="Courier New"/>
+          <w:color w:val="1B2A4A"/>
+          <w:sz w:val="17"/>
+          <w:szCs w:val="17"/>
+        </w:rPr>
+        <w:t xml:space="preserve"> 43017?</w:t>
+      </w:r>
+    </w:p>
+    <w:p>
+      <w:pPr>
+        <w:keepLines/>
+        <w:shd w:fill="F2F4F7" w:val="clear"/>
+        <w:spacing w:after="0"/>
+        <w:ind w:left="100" w:right="100"/>
+      </w:pPr>
+      <w:r>
+        <w:rPr>
+          <w:rFonts w:ascii="Courier New" w:cs="Courier New" w:eastAsia="Courier New" w:hAnsi="Courier New"/>
+          <w:b w:val="false"/>
+          <w:bCs w:val="false"/>
+          <w:color w:val="1B2A4A"/>
+          <w:sz w:val="17"/>
+          <w:szCs w:val="17"/>
+        </w:rPr>
+        <w:t xml:space="preserve">JOHN</w:t>
+      </w:r>
+      <w:r>
+        <w:rPr>
+          <w:rFonts w:ascii="Courier New" w:cs="Courier New" w:eastAsia="Courier New" w:hAnsi="Courier New"/>
+          <w:color w:val="1B2A4A"/>
+          <w:sz w:val="17"/>
+          <w:szCs w:val="17"/>
+        </w:rPr>
+        <w:t xml:space="preserve">:   Yes.</w:t>
+      </w:r>
+    </w:p>
+    <w:p>
+      <w:pPr>
+        <w:keepLines/>
+        <w:shd w:fill="F2F4F7" w:val="clear"/>
+        <w:spacing w:after="0"/>
+        <w:ind w:left="100" w:right="100"/>
+      </w:pPr>
+      <w:r>
+        <w:rPr>
+          <w:rFonts w:ascii="Courier New" w:cs="Courier New" w:eastAsia="Courier New" w:hAnsi="Courier New"/>
+          <w:b w:val="false"/>
+          <w:bCs w:val="false"/>
+          <w:color w:val="1B2A4A"/>
+          <w:sz w:val="17"/>
+          <w:szCs w:val="17"/>
+        </w:rPr>
+        <w:t xml:space="preserve">YOU</w:t>
+      </w:r>
+      <w:r>
+        <w:rPr>
+          <w:rFonts w:ascii="Courier New" w:cs="Courier New" w:eastAsia="Courier New" w:hAnsi="Courier New"/>
+          <w:color w:val="1B2A4A"/>
+          <w:sz w:val="17"/>
+          <w:szCs w:val="17"/>
+        </w:rPr>
+        <w:t xml:space="preserve">:    Great. Juan David, our installer, will review this and we'll call you back today with your exact price.</w:t>
+      </w:r>
+    </w:p>
+    <w:p>
+      <w:pPr>
+        <w:keepLines/>
+        <w:shd w:fill="F2F4F7" w:val="clear"/>
+        <w:spacing w:after="0"/>
+        <w:ind w:left="100" w:right="100"/>
+      </w:pPr>
+      <w:r>
+        <w:rPr>
+          <w:rFonts w:ascii="Courier New" w:cs="Courier New" w:eastAsia="Courier New" w:hAnsi="Courier New"/>
+          <w:b w:val="false"/>
+          <w:bCs w:val="false"/>
+          <w:color w:val="1B2A4A"/>
+          <w:sz w:val="17"/>
+          <w:szCs w:val="17"/>
+        </w:rPr>
+        <w:t xml:space="preserve">JOHN</w:t>
+      </w:r>
+      <w:r>
+        <w:rPr>
+          <w:rFonts w:ascii="Courier New" w:cs="Courier New" w:eastAsia="Courier New" w:hAnsi="Courier New"/>
+          <w:color w:val="1B2A4A"/>
+          <w:sz w:val="17"/>
+          <w:szCs w:val="17"/>
+        </w:rPr>
+        <w:t xml:space="preserve">:   I don't know... I don't want to pay anything upfront.</w:t>
+      </w:r>
+    </w:p>
+    <w:p>
+      <w:pPr>
+        <w:keepLines/>
+        <w:shd w:fill="F2F4F7" w:val="clear"/>
+        <w:spacing w:after="0"/>
+        <w:ind w:left="100" w:right="100"/>
+      </w:pPr>
+      <w:r>
+        <w:rPr>
+          <w:rFonts w:ascii="Courier New" w:cs="Courier New" w:eastAsia="Courier New" w:hAnsi="Courier New"/>
+          <w:b w:val="false"/>
+          <w:bCs w:val="false"/>
+          <w:color w:val="1B2A4A"/>
+          <w:sz w:val="17"/>
+          <w:szCs w:val="17"/>
+        </w:rPr>
+        <w:t xml:space="preserve">YOU</w:t>
+      </w:r>
+      <w:r>
+        <w:rPr>
+          <w:rFonts w:ascii="Courier New" w:cs="Courier New" w:eastAsia="Courier New" w:hAnsi="Courier New"/>
+          <w:color w:val="1B2A4A"/>
+          <w:sz w:val="17"/>
+          <w:szCs w:val="17"/>
+        </w:rPr>
+        <w:t xml:space="preserve">:    No problem — you can sign the contract and pay when the job is done. We'll call you this afternoon with the price. Thank you, John!</w:t>
       </w:r>
     </w:p>
     <w:p>
@@ -2107,7 +2278,7 @@
         <w:sz w:val="16"/>
         <w:szCs w:val="16"/>
       </w:rPr>
-      <w:t xml:space="preserve">   |   Inducción · Angélica León</w:t>
+      <w:t xml:space="preserve">   |   Paquete de inducción</w:t>
     </w:r>
   </w:p>
 </w:hdr>

</xml_diff>

<commit_message>
Aire Express setter: separate furnace replacement (phone quote) from new furnace install (free visit)
Co-Authored-By: Claude Opus 5.5 <noreply@anthropic.com>
</commit_message>
<xml_diff>
--- a/induccion-aire-express/guiones/docs/01_SOLICITUD_VIDEO_DE_LLAMADA.docx
+++ b/induccion-aire-express/guiones/docs/01_SOLICITUD_VIDEO_DE_LLAMADA.docx
@@ -654,7 +654,27 @@
           <w:sz w:val="20"/>
           <w:szCs w:val="20"/>
         </w:rPr>
-        <w:t xml:space="preserve"> John pidió en la página un furnace nuevo para su casa en Dublin, Ohio. Lo llamas 10 minutos después.</w:t>
+        <w:t xml:space="preserve"> John pidió en la página </w:t>
+      </w:r>
+      <w:r>
+        <w:rPr>
+          <w:rFonts w:ascii="Arial" w:cs="Arial" w:eastAsia="Arial" w:hAnsi="Arial"/>
+          <w:b/>
+          <w:bCs/>
+          <w:color w:val="333333"/>
+          <w:sz w:val="20"/>
+          <w:szCs w:val="20"/>
+        </w:rPr>
+        <w:t xml:space="preserve">cambiar su furnace</w:t>
+      </w:r>
+      <w:r>
+        <w:rPr>
+          <w:rFonts w:ascii="Arial" w:cs="Arial" w:eastAsia="Arial" w:hAnsi="Arial"/>
+          <w:color w:val="333333"/>
+          <w:sz w:val="20"/>
+          <w:szCs w:val="20"/>
+        </w:rPr>
+        <w:t xml:space="preserve"> (reemplazo: ya tiene uno viejo) para su casa en Dublin, Ohio. Lo llamas 10 minutos después.</w:t>
       </w:r>
     </w:p>
     <w:p>
@@ -682,7 +702,7 @@
           <w:sz w:val="17"/>
           <w:szCs w:val="17"/>
         </w:rPr>
-        <w:t xml:space="preserve">:    Hi John, this is Angélica from Aire Express. You requested a new furnace for your home in Dublin. Is this a good time?</w:t>
+        <w:t xml:space="preserve">:    Hi John, this is Angélica from Aire Express. You asked about replacing your furnace at your home in Dublin. Is this a good time?</w:t>
       </w:r>
     </w:p>
     <w:p>

</xml_diff>